<commit_message>
update bài tập ngày 3/3
</commit_message>
<xml_diff>
--- a/ảnh kết quả bài tập NNPTUD ngày 3-3.docx
+++ b/ảnh kết quả bài tập NNPTUD ngày 3-3.docx
@@ -17,11 +17,6 @@
       <w:r>
         <w:br/>
       </w:r>
-      <w:r>
-        <w:t>sort ở price và title</w:t>
-      </w:r>
-      <w:bookmarkStart w:id="0" w:name="_GoBack"/>
-      <w:bookmarkEnd w:id="0"/>
       <w:r>
         <w:br/>
       </w:r>
@@ -46,94 +41,60 @@
             <v:path o:extrusionok="f" gradientshapeok="t" o:connecttype="rect"/>
             <o:lock v:ext="edit" aspectratio="t"/>
           </v:shapetype>
-          <v:shape id="_x0000_i1033" type="#_x0000_t75" style="width:452.45pt;height:282.9pt">
-            <v:imagedata r:id="rId4" o:title="Screenshot 2026-03-03 085840"/>
+          <v:shape id="_x0000_i1114" type="#_x0000_t75" style="width:453.5pt;height:267.85pt">
+            <v:imagedata r:id="rId4" o:title="Screenshot 2026-03-03 104756"/>
           </v:shape>
         </w:pict>
       </w:r>
       <w:r>
-        <w:rPr>
-          <w:noProof/>
-        </w:rPr>
-        <w:drawing>
-          <wp:inline distT="0" distB="0" distL="0" distR="0">
-            <wp:extent cx="5746115" cy="3592830"/>
-            <wp:effectExtent l="0" t="0" r="6985" b="7620"/>
-            <wp:docPr id="1" name="Picture 1" descr="C:\Users\mihvu\AppData\Local\Microsoft\Windows\INetCache\Content.Word\Screenshot 2026-03-03 090112.png"/>
-            <wp:cNvGraphicFramePr>
-              <a:graphicFrameLocks xmlns:a="http://schemas.openxmlformats.org/drawingml/2006/main" noChangeAspect="1"/>
-            </wp:cNvGraphicFramePr>
-            <a:graphic xmlns:a="http://schemas.openxmlformats.org/drawingml/2006/main">
-              <a:graphicData uri="http://schemas.openxmlformats.org/drawingml/2006/picture">
-                <pic:pic xmlns:pic="http://schemas.openxmlformats.org/drawingml/2006/picture">
-                  <pic:nvPicPr>
-                    <pic:cNvPr id="0" name="Picture 17" descr="C:\Users\mihvu\AppData\Local\Microsoft\Windows\INetCache\Content.Word\Screenshot 2026-03-03 090112.png"/>
-                    <pic:cNvPicPr>
-                      <a:picLocks noChangeAspect="1" noChangeArrowheads="1"/>
-                    </pic:cNvPicPr>
-                  </pic:nvPicPr>
-                  <pic:blipFill>
-                    <a:blip r:embed="rId5" cstate="print">
-                      <a:extLst>
-                        <a:ext uri="{28A0092B-C50C-407E-A947-70E740481C1C}">
-                          <a14:useLocalDpi xmlns:a14="http://schemas.microsoft.com/office/drawing/2010/main" val="0"/>
-                        </a:ext>
-                      </a:extLst>
-                    </a:blip>
-                    <a:srcRect/>
-                    <a:stretch>
-                      <a:fillRect/>
-                    </a:stretch>
-                  </pic:blipFill>
-                  <pic:spPr bwMode="auto">
-                    <a:xfrm>
-                      <a:off x="0" y="0"/>
-                      <a:ext cx="5746115" cy="3592830"/>
-                    </a:xfrm>
-                    <a:prstGeom prst="rect">
-                      <a:avLst/>
-                    </a:prstGeom>
-                    <a:noFill/>
-                    <a:ln>
-                      <a:noFill/>
-                    </a:ln>
-                  </pic:spPr>
-                </pic:pic>
-              </a:graphicData>
-            </a:graphic>
-          </wp:inline>
-        </w:drawing>
-      </w:r>
+        <w:pict>
+          <v:shape id="_x0000_i1115" type="#_x0000_t75" style="width:453.5pt;height:268.2pt">
+            <v:imagedata r:id="rId5" o:title="Screenshot 2026-03-03 104805"/>
+          </v:shape>
+        </w:pict>
+      </w:r>
+    </w:p>
+    <w:p>
+      <w:pPr>
+        <w:ind w:firstLine="0"/>
+        <w:jc w:val="left"/>
+      </w:pPr>
       <w:r>
         <w:lastRenderedPageBreak/>
         <w:pict>
-          <v:shape id="_x0000_i1034" type="#_x0000_t75" style="width:452.45pt;height:282.9pt">
-            <v:imagedata r:id="rId6" o:title="Screenshot 2026-03-03 085706"/>
+          <v:shape id="_x0000_i1120" type="#_x0000_t75" style="width:453.5pt;height:268.2pt">
+            <v:imagedata r:id="rId6" o:title="Screenshot 2026-03-03 104816"/>
           </v:shape>
         </w:pict>
       </w:r>
       <w:r>
         <w:pict>
-          <v:shape id="_x0000_i1035" type="#_x0000_t75" style="width:452.45pt;height:282.9pt">
-            <v:imagedata r:id="rId7" o:title="Screenshot 2026-03-03 085651"/>
+          <v:shape id="_x0000_i1121" type="#_x0000_t75" style="width:452.45pt;height:282.9pt">
+            <v:imagedata r:id="rId7" o:title="Screenshot 2026-03-03 105118"/>
           </v:shape>
         </w:pict>
       </w:r>
       <w:r>
         <w:lastRenderedPageBreak/>
         <w:pict>
-          <v:shape id="_x0000_i1036" type="#_x0000_t75" style="width:452.45pt;height:282.9pt">
-            <v:imagedata r:id="rId8" o:title="Screenshot 2026-03-03 085641"/>
+          <v:shape id="_x0000_i1126" type="#_x0000_t75" style="width:452.45pt;height:266.5pt">
+            <v:imagedata r:id="rId8" o:title="Screenshot 2026-03-03 104943"/>
           </v:shape>
         </w:pict>
       </w:r>
       <w:r>
         <w:pict>
-          <v:shape id="_x0000_i1037" type="#_x0000_t75" style="width:452.45pt;height:282.9pt">
-            <v:imagedata r:id="rId9" o:title="Screenshot 2026-03-03 085854"/>
+          <v:shape id="_x0000_i1123" type="#_x0000_t75" style="width:453.5pt;height:268.55pt">
+            <v:imagedata r:id="rId9" o:title="Screenshot 2026-03-03 104854"/>
           </v:shape>
         </w:pict>
       </w:r>
+      <w:r>
+        <w:br/>
+        <w:t>sort price và title</w:t>
+      </w:r>
+      <w:bookmarkStart w:id="0" w:name="_GoBack"/>
+      <w:bookmarkEnd w:id="0"/>
     </w:p>
     <w:sectPr>
       <w:type w:val="evenPage"/>

</xml_diff>